<commit_message>
docs: simplify Microsoft routing briefing language
</commit_message>
<xml_diff>
--- a/output/doc/2026-07-10-microsoft-unicode-routing-briefing.docx
+++ b/output/doc/2026-07-10-microsoft-unicode-routing-briefing.docx
@@ -24,7 +24,25 @@
         <w:pStyle w:val="FirstParagraph"/>
       </w:pPr>
       <w:r>
-        <w:t xml:space="preserve">This briefing identifies the people and internal routes most relevant to the health-related emoji L2 document and the accompanying individual emoji proposals.</w:t>
+        <w:t xml:space="preserve">This briefing explains who at Microsoft should see the medical emoji plan, what each person can help with, and what we should ask them to do.</w:t>
+      </w:r>
+    </w:p>
+    <w:p>
+      <w:pPr>
+        <w:pStyle w:val="BodyText"/>
+      </w:pPr>
+      <w:r>
+        <w:rPr>
+          <w:b/>
+          <w:bCs/>
+        </w:rPr>
+        <w:t xml:space="preserve">Plain-language guide:</w:t>
+      </w:r>
+      <w:r>
+        <w:t xml:space="preserve"> </w:t>
+      </w:r>
+      <w:r>
+        <w:t xml:space="preserve">Unicode is the international system that makes text and emoji work across devices. The Unicode Technical Committee (UTC) oversees the standard. The Emoji Standard and Research Working Group (ESR) reviews emoji proposals and recommends which ones should move forward.</w:t>
       </w:r>
     </w:p>
     <w:bookmarkStart w:id="9" w:name="recommended-internal-route"/>
@@ -59,7 +77,7 @@
         </w:numPr>
       </w:pPr>
       <w:r>
-        <w:t xml:space="preserve">Owns the health rationale and coordinates the medical review.</w:t>
+        <w:t xml:space="preserve">He can explain why the medical concepts matter and coordinate the medical review.</w:t>
       </w:r>
     </w:p>
     <w:p>
@@ -85,7 +103,7 @@
         </w:numPr>
       </w:pPr>
       <w:r>
-        <w:t xml:space="preserve">Coordinates the internal review package and routes it to the appropriate standards and product owners.</w:t>
+        <w:t xml:space="preserve">She can help circulate the package inside Microsoft and identify the right standards and product contacts.</w:t>
       </w:r>
     </w:p>
     <w:p>
@@ -100,7 +118,7 @@
           <w:b/>
           <w:bCs/>
         </w:rPr>
-        <w:t xml:space="preserve">Microsoft Unicode and standards representative</w:t>
+        <w:t xml:space="preserve">Microsoft person responsible for Unicode and standards</w:t>
       </w:r>
     </w:p>
     <w:p>
@@ -111,7 +129,7 @@
         </w:numPr>
       </w:pPr>
       <w:r>
-        <w:t xml:space="preserve">Confirms the correct UTC/ESR submission path, document-register process, and any internal Microsoft review requirements.</w:t>
+        <w:t xml:space="preserve">This person can tell us how Microsoft normally sends a standards document to the Unicode committee and what internal approvals are needed.</w:t>
       </w:r>
     </w:p>
     <w:p>
@@ -126,7 +144,7 @@
           <w:b/>
           <w:bCs/>
         </w:rPr>
-        <w:t xml:space="preserve">Vishal Chowdhary - Microsoft Board member at Unicode</w:t>
+        <w:t xml:space="preserve">Vishal Chowdhary - Microsoft representative on the Unicode Board</w:t>
       </w:r>
     </w:p>
     <w:p>
@@ -137,7 +155,7 @@
         </w:numPr>
       </w:pPr>
       <w:r>
-        <w:t xml:space="preserve">Provides the board-level internal decision point: whether Microsoft should sponsor and route the standards discussion. The Unicode Board page identifies Vishal Chowdhary as a Microsoft Vice President of Science and a 2026-present Board member.</w:t>
+        <w:t xml:space="preserve">He is the senior internal decision point for whether Microsoft should support and route the discussion. Unicode identifies him as a Microsoft Vice President of Science and a Board member beginning in 2026.</w:t>
       </w:r>
     </w:p>
     <w:p>
@@ -152,7 +170,7 @@
           <w:b/>
           <w:bCs/>
         </w:rPr>
-        <w:t xml:space="preserve">Peter Constable - UTC Chair; former Microsoft standards leader</w:t>
+        <w:t xml:space="preserve">Peter Constable - Chair of the Unicode Technical Committee; former Microsoft standards leader</w:t>
       </w:r>
     </w:p>
     <w:p>
@@ -163,7 +181,7 @@
         </w:numPr>
       </w:pPr>
       <w:r>
-        <w:t xml:space="preserve">Appropriate for process guidance and routing questions. He should not be asked to endorse a medical concept or promise an outcome. The UTC page identifies him as the current Chair.</w:t>
+        <w:t xml:space="preserve">He can explain the correct process and where the document should go. We should not ask him to endorse a medical concept or promise a result. Unicode identifies him as the current committee chair.</w:t>
       </w:r>
     </w:p>
     <w:p>
@@ -178,7 +196,7 @@
           <w:b/>
           <w:bCs/>
         </w:rPr>
-        <w:t xml:space="preserve">Microsoft Accessibility or Inclusive Design lead</w:t>
+        <w:t xml:space="preserve">Microsoft accessibility or inclusive-design lead</w:t>
       </w:r>
     </w:p>
     <w:p>
@@ -189,7 +207,7 @@
         </w:numPr>
       </w:pPr>
       <w:r>
-        <w:t xml:space="preserve">Reviews small-size legibility, color and black-and-white accessibility, and platform-neutral visual paradigms for individual proposals.</w:t>
+        <w:t xml:space="preserve">Reviews whether each proposed image is easy to recognize when it is very small and whether it remains understandable without relying only on color.</w:t>
       </w:r>
     </w:p>
     <w:p>
@@ -204,7 +222,7 @@
           <w:b/>
           <w:bCs/>
         </w:rPr>
-        <w:t xml:space="preserve">Microsoft Windows emoji, typography, or globalization lead</w:t>
+        <w:t xml:space="preserve">Microsoft Windows emoji, font, or internationalization lead</w:t>
       </w:r>
     </w:p>
     <w:p>
@@ -215,7 +233,7 @@
         </w:numPr>
       </w:pPr>
       <w:r>
-        <w:t xml:space="preserve">Reviews anticipated rendering and implementation considerations. This is technical input, not evidence of usage or a commitment to ship.</w:t>
+        <w:t xml:space="preserve">Reviews how the images might look in Windows and other Microsoft products. This is technical advice, not proof that people use the concept and not a promise to release it.</w:t>
       </w:r>
     </w:p>
     <w:p>
@@ -230,7 +248,7 @@
           <w:b/>
           <w:bCs/>
         </w:rPr>
-        <w:t xml:space="preserve">Microsoft Legal/IP reviewer</w:t>
+        <w:t xml:space="preserve">Microsoft legal and copyright reviewer</w:t>
       </w:r>
     </w:p>
     <w:p>
@@ -241,7 +259,7 @@
         </w:numPr>
       </w:pPr>
       <w:r>
-        <w:t xml:space="preserve">Confirms artwork ownership, assignments, open-license provenance, and readiness for the Unicode Emoji Proposal Agreement and License.</w:t>
+        <w:t xml:space="preserve">Confirms who owns each drawing, whether the rights were properly transferred, and whether the artwork can be licensed under Unicode's rules.</w:t>
       </w:r>
     </w:p>
     <w:bookmarkEnd w:id="9"/>
@@ -269,7 +287,7 @@
         <w:t xml:space="preserve"> </w:t>
       </w:r>
       <w:r>
-        <w:t xml:space="preserve">the L2, the individual proposal status matrix, and the decision brief.</w:t>
+        <w:t xml:space="preserve">the main Unicode discussion document, the table showing the status of each emoji proposal, and the one-page decision brief.</w:t>
       </w:r>
     </w:p>
     <w:p>
@@ -287,7 +305,7 @@
         <w:t xml:space="preserve"> </w:t>
       </w:r>
       <w:r>
-        <w:t xml:space="preserve">the one-page internal decision brief and the question: “Should Microsoft sponsor and route this package for internal standards review?”</w:t>
+        <w:t xml:space="preserve">the one-page decision brief and this question: “Should Microsoft support this package and send it through the normal Unicode review process?”</w:t>
       </w:r>
     </w:p>
     <w:p>
@@ -305,7 +323,7 @@
         <w:t xml:space="preserve"> </w:t>
       </w:r>
       <w:r>
-        <w:t xml:space="preserve">the final L2 and the question: “What is the correct UTC/ESR route for a Microsoft-supported standards discussion?”</w:t>
+        <w:t xml:space="preserve">the main discussion document and this question: “What is the correct way for Microsoft to send this document to the Unicode committee?”</w:t>
       </w:r>
     </w:p>
     <w:p>
@@ -317,13 +335,13 @@
           <w:b/>
           <w:bCs/>
         </w:rPr>
-        <w:t xml:space="preserve">Accessibility and Windows/typography reviewers:</w:t>
+        <w:t xml:space="preserve">Accessibility and Windows/font reviewers:</w:t>
       </w:r>
       <w:r>
         <w:t xml:space="preserve"> </w:t>
       </w:r>
       <w:r>
-        <w:t xml:space="preserve">only the individual proposal artwork and design notes relevant to their review.</w:t>
+        <w:t xml:space="preserve">only the drawings and design notes they need to review.</w:t>
       </w:r>
     </w:p>
     <w:p>
@@ -345,13 +363,13 @@
       </w:r>
     </w:p>
     <w:bookmarkEnd w:id="10"/>
-    <w:bookmarkStart w:id="11" w:name="message-discipline"/>
+    <w:bookmarkStart w:id="11" w:name="what-we-are-and-are-not-asking-for"/>
     <w:p>
       <w:pPr>
         <w:pStyle w:val="Heading2"/>
       </w:pPr>
       <w:r>
-        <w:t xml:space="preserve">Message discipline</w:t>
+        <w:t xml:space="preserve">What we are and are not asking for</w:t>
       </w:r>
     </w:p>
     <w:p>
@@ -359,7 +377,7 @@
         <w:pStyle w:val="FirstParagraph"/>
       </w:pPr>
       <w:r>
-        <w:t xml:space="preserve">The L2 is a request for a standards review and report. It is not a request for Microsoft to guarantee encoding, adopt exact artwork, or treat sponsorship as usage evidence.</w:t>
+        <w:t xml:space="preserve">The main document asks Unicode to study how health-related emoji are organized and to report on the best way to review future proposals. It does not ask Microsoft to guarantee that an emoji will be approved, use our exact drawings, or claim that Microsoft's support proves public demand.</w:t>
       </w:r>
     </w:p>
     <w:p>
@@ -367,17 +385,17 @@
         <w:pStyle w:val="BodyText"/>
       </w:pPr>
       <w:r>
-        <w:t xml:space="preserve">Each individual emoji proposal remains separate and must satisfy Unicode's published requirements for evidence, images, rights, and inclusion and exclusion analysis.</w:t>
+        <w:t xml:space="preserve">Each emoji proposal is separate. Each one must provide its own public usage evidence, images, copyright information, and explanation of why it should or should not be represented by an existing emoji.</w:t>
       </w:r>
     </w:p>
     <w:bookmarkEnd w:id="11"/>
-    <w:bookmarkStart w:id="12" w:name="historical-microsoft-unicode-contacts"/>
+    <w:bookmarkStart w:id="12" w:name="earlier-microsoft-participants"/>
     <w:p>
       <w:pPr>
         <w:pStyle w:val="Heading2"/>
       </w:pPr>
       <w:r>
-        <w:t xml:space="preserve">Historical Microsoft Unicode contacts</w:t>
+        <w:t xml:space="preserve">Earlier Microsoft participants</w:t>
       </w:r>
     </w:p>
     <w:p>
@@ -385,7 +403,7 @@
         <w:pStyle w:val="FirstParagraph"/>
       </w:pPr>
       <w:r>
-        <w:t xml:space="preserve">The repository records Judy Safran-Aasen, Michele Coady, and Shelley Bjornstad as co-authors with Peter Constable on Microsoft's 2016 Unicode emoji data proposal, L2/16-228. Their current Microsoft roles are not confirmed, so they should be treated as historical references unless an internal contact confirms otherwise.</w:t>
+        <w:t xml:space="preserve">The project files show Judy Safran-Aasen, Michele Coady, and Shelley Bjornstad working with Peter Constable on a Microsoft Unicode emoji proposal in 2016. We have not confirmed their current Microsoft roles, so they are background references rather than confirmed contacts.</w:t>
       </w:r>
     </w:p>
     <w:p>
@@ -393,7 +411,7 @@
         <w:pStyle w:val="BodyText"/>
       </w:pPr>
       <w:r>
-        <w:t xml:space="preserve">Cathy Wissink is also documented as a former Microsoft UTC leader and former UTC vice-chair. She is useful historical context, but should not be assumed to be a current Microsoft routing contact.</w:t>
+        <w:t xml:space="preserve">Cathy Wissink is also documented as a former Microsoft leader in Unicode work and a former committee vice-chair. She is useful historical context, but should not be assumed to be a current Microsoft contact.</w:t>
       </w:r>
     </w:p>
     <w:bookmarkEnd w:id="12"/>
@@ -411,7 +429,7 @@
         <w:pStyle w:val="BlockText"/>
       </w:pPr>
       <w:r>
-        <w:t xml:space="preserve">David and Heena: attached are the final health-related emoji L2 and the individual proposal workplan. Could you route these to Microsoft's Unicode/standards representative and identify the appropriate Accessibility, Windows emoji/typography, globalization, and Legal/IP reviewers? The immediate decision is whether Microsoft will sponsor an internal review and carry the standards discussion through the appropriate UTC/ESR channel.</w:t>
+        <w:t xml:space="preserve">David and Heena: attached are the medical emoji discussion document and the proposal workplan. Could you send these to Microsoft's Unicode standards contact and identify the right people in accessibility, Windows emoji and fonts, internationalization, and legal? The immediate question is whether Microsoft will support an internal review and send the discussion through the normal Unicode process.</w:t>
       </w:r>
     </w:p>
     <w:p>

</xml_diff>

<commit_message>
docs: explain Unicode document terminology
</commit_message>
<xml_diff>
--- a/output/doc/2026-07-10-microsoft-unicode-routing-briefing.docx
+++ b/output/doc/2026-07-10-microsoft-unicode-routing-briefing.docx
@@ -10,7 +10,7 @@
         <w:t xml:space="preserve">Microsoft Unicode Routing Briefing</w:t>
       </w:r>
     </w:p>
-    <w:bookmarkStart w:id="14" w:name="purpose"/>
+    <w:bookmarkStart w:id="15" w:name="purpose"/>
     <w:p>
       <w:pPr>
         <w:pStyle w:val="Heading1"/>
@@ -45,7 +45,137 @@
         <w:t xml:space="preserve">Unicode is the international system that makes text and emoji work across devices. The Unicode Technical Committee (UTC) oversees the standard. The Emoji Standard and Research Working Group (ESR) reviews emoji proposals and recommends which ones should move forward.</w:t>
       </w:r>
     </w:p>
-    <w:bookmarkStart w:id="9" w:name="recommended-internal-route"/>
+    <w:bookmarkStart w:id="9" w:name="what-the-documents-mean"/>
+    <w:p>
+      <w:pPr>
+        <w:pStyle w:val="Heading2"/>
+      </w:pPr>
+      <w:r>
+        <w:t xml:space="preserve">What the documents mean</w:t>
+      </w:r>
+    </w:p>
+    <w:p>
+      <w:pPr>
+        <w:pStyle w:val="FirstParagraph"/>
+      </w:pPr>
+      <w:r>
+        <w:rPr>
+          <w:b/>
+          <w:bCs/>
+        </w:rPr>
+        <w:t xml:space="preserve">L2 document.</w:t>
+      </w:r>
+      <w:r>
+        <w:t xml:space="preserve"> </w:t>
+      </w:r>
+      <w:r>
+        <w:t xml:space="preserve">“L2” is the name Unicode uses for a technical document submitted for discussion. It does not mean “level two.” The number, such as</w:t>
+      </w:r>
+      <w:r>
+        <w:t xml:space="preserve"> </w:t>
+      </w:r>
+      <w:r>
+        <w:rPr>
+          <w:rStyle w:val="VerbatimChar"/>
+        </w:rPr>
+        <w:t xml:space="preserve">L2/26-xxx</w:t>
+      </w:r>
+      <w:r>
+        <w:t xml:space="preserve">, is assigned by Unicode after the document is submitted and entered in its public document register. An L2 can ask the UTC to study an issue, clarify a process, or consider a standards change. Our L2 asks Unicode to review how health-related emoji are organized and how future health-related proposals should be handled.</w:t>
+      </w:r>
+    </w:p>
+    <w:p>
+      <w:pPr>
+        <w:pStyle w:val="BodyText"/>
+      </w:pPr>
+      <w:r>
+        <w:rPr>
+          <w:b/>
+          <w:bCs/>
+        </w:rPr>
+        <w:t xml:space="preserve">Individual emoji proposal.</w:t>
+      </w:r>
+      <w:r>
+        <w:t xml:space="preserve"> </w:t>
+      </w:r>
+      <w:r>
+        <w:t xml:space="preserve">This is the separate document for one possible emoji, such as Kidney or Pill Box. It must contain its own images, public usage evidence, copyright information, and explanation of why the concept is not already covered by an existing emoji. The L2 does not replace these individual proposals.</w:t>
+      </w:r>
+    </w:p>
+    <w:p>
+      <w:pPr>
+        <w:pStyle w:val="BodyText"/>
+      </w:pPr>
+      <w:r>
+        <w:rPr>
+          <w:b/>
+          <w:bCs/>
+        </w:rPr>
+        <w:t xml:space="preserve">UTC.</w:t>
+      </w:r>
+      <w:r>
+        <w:t xml:space="preserve"> </w:t>
+      </w:r>
+      <w:r>
+        <w:t xml:space="preserve">The Unicode Technical Committee is the group that makes decisions about the Unicode Standard and decides what technical work should be assigned to its working groups.</w:t>
+      </w:r>
+    </w:p>
+    <w:p>
+      <w:pPr>
+        <w:pStyle w:val="BodyText"/>
+      </w:pPr>
+      <w:r>
+        <w:rPr>
+          <w:b/>
+          <w:bCs/>
+        </w:rPr>
+        <w:t xml:space="preserve">ESR.</w:t>
+      </w:r>
+      <w:r>
+        <w:t xml:space="preserve"> </w:t>
+      </w:r>
+      <w:r>
+        <w:t xml:space="preserve">The Emoji Standard and Research Working Group is the UTC group that reviews emoji proposals and prepares recommendations about them.</w:t>
+      </w:r>
+    </w:p>
+    <w:p>
+      <w:pPr>
+        <w:pStyle w:val="BodyText"/>
+      </w:pPr>
+      <w:r>
+        <w:rPr>
+          <w:b/>
+          <w:bCs/>
+        </w:rPr>
+        <w:t xml:space="preserve">Document register.</w:t>
+      </w:r>
+      <w:r>
+        <w:t xml:space="preserve"> </w:t>
+      </w:r>
+      <w:r>
+        <w:t xml:space="preserve">This is Unicode's public list of technical documents. A document is not an official L2 until Unicode accepts it into that process and assigns it a number.</w:t>
+      </w:r>
+    </w:p>
+    <w:p>
+      <w:pPr>
+        <w:pStyle w:val="BodyText"/>
+      </w:pPr>
+      <w:r>
+        <w:rPr>
+          <w:b/>
+          <w:bCs/>
+        </w:rPr>
+        <w:t xml:space="preserve">CLDR and emoji ordering.</w:t>
+      </w:r>
+      <w:r>
+        <w:t xml:space="preserve"> </w:t>
+      </w:r>
+      <w:r>
+        <w:t xml:space="preserve">CLDR is Unicode's shared language-data project. Emoji ordering is the arrangement used for names, keywords, and keyboard groupings. These affect how people find emoji, but changing an emoji's grouping is different from creating a new Unicode character.</w:t>
+      </w:r>
+    </w:p>
+    <w:bookmarkEnd w:id="9"/>
+    <w:bookmarkStart w:id="10" w:name="recommended-internal-route"/>
     <w:p>
       <w:pPr>
         <w:pStyle w:val="Heading2"/>
@@ -262,8 +392,8 @@
         <w:t xml:space="preserve">Confirms who owns each drawing, whether the rights were properly transferred, and whether the artwork can be licensed under Unicode's rules.</w:t>
       </w:r>
     </w:p>
-    <w:bookmarkEnd w:id="9"/>
-    <w:bookmarkStart w:id="10" w:name="what-each-person-should-receive"/>
+    <w:bookmarkEnd w:id="10"/>
+    <w:bookmarkStart w:id="11" w:name="what-each-person-should-receive"/>
     <w:p>
       <w:pPr>
         <w:pStyle w:val="Heading2"/>
@@ -362,8 +492,8 @@
         <w:t xml:space="preserve">the individual proposal artwork provenance and licensing files.</w:t>
       </w:r>
     </w:p>
-    <w:bookmarkEnd w:id="10"/>
-    <w:bookmarkStart w:id="11" w:name="what-we-are-and-are-not-asking-for"/>
+    <w:bookmarkEnd w:id="11"/>
+    <w:bookmarkStart w:id="12" w:name="what-we-are-and-are-not-asking-for"/>
     <w:p>
       <w:pPr>
         <w:pStyle w:val="Heading2"/>
@@ -388,8 +518,8 @@
         <w:t xml:space="preserve">Each emoji proposal is separate. Each one must provide its own public usage evidence, images, copyright information, and explanation of why it should or should not be represented by an existing emoji.</w:t>
       </w:r>
     </w:p>
-    <w:bookmarkEnd w:id="11"/>
-    <w:bookmarkStart w:id="12" w:name="earlier-microsoft-participants"/>
+    <w:bookmarkEnd w:id="12"/>
+    <w:bookmarkStart w:id="13" w:name="earlier-microsoft-participants"/>
     <w:p>
       <w:pPr>
         <w:pStyle w:val="Heading2"/>
@@ -414,8 +544,8 @@
         <w:t xml:space="preserve">Cathy Wissink is also documented as a former Microsoft leader in Unicode work and a former committee vice-chair. She is useful historical context, but should not be assumed to be a current Microsoft contact.</w:t>
       </w:r>
     </w:p>
-    <w:bookmarkEnd w:id="12"/>
-    <w:bookmarkStart w:id="13" w:name="recommended-first-email"/>
+    <w:bookmarkEnd w:id="13"/>
+    <w:bookmarkStart w:id="14" w:name="recommended-first-email"/>
     <w:p>
       <w:pPr>
         <w:pStyle w:val="Heading2"/>
@@ -440,8 +570,8 @@
         <w:t xml:space="preserve">Sources: Unicode Board of Directors, Unicode Technical Committee, Microsoft's 2016 Unicode emoji data proposal (L2/16-228), and the current Unicode Emoji proposal guidelines.</w:t>
       </w:r>
     </w:p>
-    <w:bookmarkEnd w:id="13"/>
     <w:bookmarkEnd w:id="14"/>
+    <w:bookmarkEnd w:id="15"/>
     <w:sectPr>
       <w:footnotePr>
         <w:numRestart w:val="eachSect"/>

</xml_diff>